<commit_message>
docs: drpetric.ro migration executed (13x301 + GSC move), press release adds Dr. Cozma
Co-Authored-By: Claude Fable 5 <noreply@anthropic.com>
</commit_message>
<xml_diff>
--- a/docs/docx/Comunicat-presa-DENTCRAFT-Satu-Mare.docx
+++ b/docs/docx/Comunicat-presa-DENTCRAFT-Satu-Mare.docx
@@ -20,7 +20,7 @@
           <w:b/>
           <w:bCs/>
         </w:rPr>
-        <w:t xml:space="preserve">O clinică din Satu Mare apropie stomatologia de pacient: șase specialiști, sub același acoperiș</w:t>
+        <w:t>O clinică din Satu Mare apropie stomatologia de pacient: șapte specialiști, sub același acoperiș</w:t>
       </w:r>
     </w:p>
     <w:p>
@@ -32,13 +32,7 @@
           <w:b/>
           <w:bCs/>
         </w:rPr>
-        <w:t xml:space="preserve">Satu Mare, 23 iunie 2026</w:t>
-      </w:r>
-      <w:r>
-        <w:t xml:space="preserve"> </w:t>
-      </w:r>
-      <w:r>
-        <w:t xml:space="preserve">— Tot mai mulți pacienți din Satu Mare și din împrejurimi caută un loc unde să-și rezolve problemele dentare fără să fie trimiși de la un cabinet la altul. La DENTCRAFT, clinica de pe strada Barbu Ștefănescu Delavrancea nr. 3, răspunsul vine dintr-o echipă de șase specialiști care acoperă, împreună, majoritatea nevoilor unei guri — de la o plombă obișnuită până la cazuri mai complicate.</w:t>
+        <w:t>Satu Mare, 23 iunie 2026 — Tot mai mulți pacienți din Satu Mare și din împrejurimi caută un loc unde să-și rezolve problemele dentare fără să fie trimiși de la un cabinet la altul. La DENTCRAFT, clinica de pe strada Barbu Ștefănescu Delavrancea nr. 3, răspunsul vine dintr-o echipă de șapte specialiști care acoperă, împreună, majoritatea nevoilor unei guri — de la o plombă obișnuită până la cazuri mai complicate.</w:t>
       </w:r>
     </w:p>
     <w:p>
@@ -63,7 +57,7 @@
         <w:pStyle w:val="FirstParagraph"/>
       </w:pPr>
       <w:r>
-        <w:t>Echipa este coordonată de Dr. Petric Răzvan-Tudor, medic stomatolog cu competențe în implantologie și estetică dentară. Alături de el lucrează Dr. Buterchi Codruț-Ciprian, medic specialist în chirurgie dento-alveolară, Dr. Tincu Giovana-Nicoleta, specialist parodontolog, și Dr. Ghirasim Denisa-Ștefania, dedicată stomatologiei pentru copii. Practic, un caz care are nevoie de mai mulți medici se rezolvă intern, între colegi, fără ca pacientul să fie plimbat prin oraș.</w:t>
+        <w:t>Echipa este coordonată de Dr. Petric Răzvan-Tudor, medic stomatolog cu competențe în implantologie și estetică dentară. Alături de el lucrează Dr. Buterchi Codruț-Ciprian, medic specialist în chirurgie dento-alveolară, Dr. Tincu Giovana-Nicoleta, specialist parodontolog, Dr. Ghirasim Denisa-Ștefania, dedicată stomatologiei pentru copii, și Dr. Cozma Ștefana, medic ortodont, cea mai nouă colegă a echipei. Practic, un caz care are nevoie de mai mulți medici se rezolvă intern, între colegi, fără ca pacientul să fie plimbat prin oraș.</w:t>
       </w:r>
     </w:p>
     <w:p>
@@ -147,10 +141,7 @@
         <w:pStyle w:val="FirstParagraph"/>
       </w:pPr>
       <w:r>
-        <w:t xml:space="preserve">DENTCRAFT este o</w:t>
-      </w:r>
-      <w:r>
-        <w:t xml:space="preserve"> </w:t>
+        <w:t>DENTCRAFT este o clinică stomatologică din Satu Mare, cu o echipă de șapte specialiști și peste 10 ani de experiență, care oferă servicii de stomatologie contemporană: implantologie, ortodonție, chirurgie, estetică dentară, protetică, parodontologie și pedodonție. Clinica se află pe strada Barbu Ștefănescu Delavrancea nr. 3, Satu Mare.</w:t>
       </w:r>
       <w:hyperlink r:id="rId13">
         <w:r>
@@ -160,9 +151,6 @@
           <w:t xml:space="preserve">clinică stomatologică din Satu Mare</w:t>
         </w:r>
       </w:hyperlink>
-      <w:r>
-        <w:t xml:space="preserve">, cu o echipă de șase specialiști și peste 10 ani de experiență, care oferă servicii de stomatologie contemporană: implantologie, ortodonție, chirurgie, estetică dentară, protetică, parodontologie și pedodonție. Clinica se află pe strada Barbu Ștefănescu Delavrancea nr. 3, Satu Mare.</w:t>
-      </w:r>
     </w:p>
     <w:p>
       <w:pPr>

</xml_diff>